<commit_message>
docs: document the Claude Code plugin install
Add the plugin marketplace option next to the existing Claude Code
steps in the README, Tools page, llms.txt and the app-governance
platform guide. Regenerate dist and site.

Fixes #24

Co-Authored-By: Claude Sonnet 5.5 <noreply@anthropic.com>
Claude-Session: https://claude.ai/code/session_01N95whJG8F12djHVw7wTSjj
</commit_message>
<xml_diff>
--- a/site/docs/app-governance/platform-guide.docx
+++ b/site/docs/app-governance/platform-guide.docx
@@ -41,7 +41,16 @@
         <w:t xml:space="preserve">Claude Code:</w:t>
       </w:r>
       <w:r>
-        <w:t xml:space="preserve"> install the skills from the Tools page. Optionally save the app governance agent to </w:t>
+        <w:t xml:space="preserve"> install the skills from the Tools page, or install the </w:t>
+      </w:r>
+      <w:r>
+        <w:rPr>
+          <w:rFonts w:ascii="Consolas" w:hAnsi="Consolas"/>
+        </w:rPr>
+        <w:t xml:space="preserve">app-governance-kit@evemcgivern-skills</w:t>
+      </w:r>
+      <w:r>
+        <w:t xml:space="preserve"> plugin, which includes the agent. Optionally save the app governance agent to </w:t>
       </w:r>
       <w:r>
         <w:rPr>

</xml_diff>

<commit_message>
docs: install steps for each platform (#25)
Fixes #24
</commit_message>
<xml_diff>
--- a/site/docs/app-governance/platform-guide.docx
+++ b/site/docs/app-governance/platform-guide.docx
@@ -41,7 +41,16 @@
         <w:t xml:space="preserve">Claude Code:</w:t>
       </w:r>
       <w:r>
-        <w:t xml:space="preserve"> install the skills from the Tools page. Optionally save the app governance agent to </w:t>
+        <w:t xml:space="preserve"> install the skills from the Tools page, or install the </w:t>
+      </w:r>
+      <w:r>
+        <w:rPr>
+          <w:rFonts w:ascii="Consolas" w:hAnsi="Consolas"/>
+        </w:rPr>
+        <w:t xml:space="preserve">app-governance-kit@evemcgivern-skills</w:t>
+      </w:r>
+      <w:r>
+        <w:t xml:space="preserve"> plugin, which includes the agent. Optionally save the app governance agent to </w:t>
       </w:r>
       <w:r>
         <w:rPr>

</xml_diff>